<commit_message>
Brand the Phase 1 copy tracker with the Otta logo, Raleway and Ocean accents
Co-Authored-By: Claude Opus 5.5 <noreply@anthropic.com>
Claude-Session: https://claude.ai/code/session_01Eh5mpih4ShNW6P8Q6cSYEM
</commit_message>
<xml_diff>
--- a/docs/Otta Website copy tracker - PHASE 1.docx
+++ b/docs/Otta Website copy tracker - PHASE 1.docx
@@ -5,7 +5,10 @@
     <w:p>
       <w:pPr>
         <w:pStyle w:val="Title"/>
-        <w:spacing w:after="120"/>
+        <w:pBdr>
+          <w:bottom w:val="single" w:sz="24" w:space="8" w:color="76BAB2"/>
+        </w:pBdr>
+        <w:spacing w:after="160"/>
       </w:pPr>
       <w:r>
         <w:rPr>
@@ -18003,7 +18006,7 @@
       <w:headerReference w:type="default" r:id="rId14"/>
       <w:footerReference w:type="default" r:id="rId15"/>
       <w:pgSz w:w="11906" w:h="16838"/>
-      <w:pgMar w:top="1134" w:right="1134" w:bottom="1134" w:left="1134" w:header="708" w:footer="708" w:gutter="0"/>
+      <w:pgMar w:top="1474" w:right="1134" w:bottom="1134" w:left="1134" w:header="708" w:footer="708" w:gutter="0"/>
       <w:cols w:space="720"/>
       <w:docGrid w:linePitch="360"/>
     </w:sectPr>
@@ -18034,6 +18037,9 @@
 <w:ftr xmlns:wpc="http://schemas.microsoft.com/office/word/2010/wordprocessingCanvas" xmlns:cx="http://schemas.microsoft.com/office/drawing/2014/chartex" xmlns:cx1="http://schemas.microsoft.com/office/drawing/2015/9/8/chartex" xmlns:cx2="http://schemas.microsoft.com/office/drawing/2015/10/21/chartex" xmlns:cx3="http://schemas.microsoft.com/office/drawing/2016/5/9/chartex" xmlns:cx4="http://schemas.microsoft.com/office/drawing/2016/5/10/chartex" xmlns:cx5="http://schemas.microsoft.com/office/drawing/2016/5/11/chartex" xmlns:cx6="http://schemas.microsoft.com/office/drawing/2016/5/12/chartex" xmlns:cx7="http://schemas.microsoft.com/office/drawing/2016/5/13/chartex" xmlns:cx8="http://schemas.microsoft.com/office/drawing/2016/5/14/chartex" xmlns:mc="http://schemas.openxmlformats.org/markup-compatibility/2006" xmlns:aink="http://schemas.microsoft.com/office/drawing/2016/ink" xmlns:am3d="http://schemas.microsoft.com/office/drawing/2017/model3d" xmlns:o="urn:schemas-microsoft-com:office:office" xmlns:oel="http://schemas.microsoft.com/office/2019/extlst" xmlns:r="http://schemas.openxmlformats.org/officeDocument/2006/relationships" xmlns:m="http://schemas.openxmlformats.org/officeDocument/2006/math" xmlns:v="urn:schemas-microsoft-com:vml" xmlns:wp14="http://schemas.microsoft.com/office/word/2010/wordprocessingDrawing" xmlns:wp="http://schemas.openxmlformats.org/drawingml/2006/wordprocessingDrawing" xmlns:w10="urn:schemas-microsoft-com:office:word" xmlns:w="http://schemas.openxmlformats.org/wordprocessingml/2006/main" xmlns:w14="http://schemas.microsoft.com/office/word/2010/wordml" xmlns:w15="http://schemas.microsoft.com/office/word/2012/wordml" xmlns:w16cex="http://schemas.microsoft.com/office/word/2018/wordml/cex" xmlns:w16cid="http://schemas.microsoft.com/office/word/2016/wordml/cid" xmlns:w16="http://schemas.microsoft.com/office/word/2018/wordml" xmlns:w16du="http://schemas.microsoft.com/office/word/2023/wordml/word16du" xmlns:w16sdtdh="http://schemas.microsoft.com/office/word/2020/wordml/sdtdatahash" xmlns:w16sdtfl="http://schemas.microsoft.com/office/word/2024/wordml/sdtformatlock" xmlns:w16se="http://schemas.microsoft.com/office/word/2015/wordml/symex" xmlns:wpg="http://schemas.microsoft.com/office/word/2010/wordprocessingGroup" xmlns:wpi="http://schemas.microsoft.com/office/word/2010/wordprocessingInk" xmlns:wne="http://schemas.microsoft.com/office/word/2006/wordml" xmlns:wps="http://schemas.microsoft.com/office/word/2010/wordprocessingShape" mc:Ignorable="w14 w15 w16se w16cid w16 w16cex w16sdtdh w16sdtfl w16du wp14">
   <w:p>
     <w:pPr>
+      <w:pBdr>
+        <w:top w:val="single" w:sz="4" w:space="6" w:color="76BAB2"/>
+      </w:pBdr>
       <w:jc w:val="right"/>
     </w:pPr>
     <w:r>
@@ -18161,8 +18167,56 @@
 <w:hdr xmlns:wpc="http://schemas.microsoft.com/office/word/2010/wordprocessingCanvas" xmlns:cx="http://schemas.microsoft.com/office/drawing/2014/chartex" xmlns:cx1="http://schemas.microsoft.com/office/drawing/2015/9/8/chartex" xmlns:cx2="http://schemas.microsoft.com/office/drawing/2015/10/21/chartex" xmlns:cx3="http://schemas.microsoft.com/office/drawing/2016/5/9/chartex" xmlns:cx4="http://schemas.microsoft.com/office/drawing/2016/5/10/chartex" xmlns:cx5="http://schemas.microsoft.com/office/drawing/2016/5/11/chartex" xmlns:cx6="http://schemas.microsoft.com/office/drawing/2016/5/12/chartex" xmlns:cx7="http://schemas.microsoft.com/office/drawing/2016/5/13/chartex" xmlns:cx8="http://schemas.microsoft.com/office/drawing/2016/5/14/chartex" xmlns:mc="http://schemas.openxmlformats.org/markup-compatibility/2006" xmlns:aink="http://schemas.microsoft.com/office/drawing/2016/ink" xmlns:am3d="http://schemas.microsoft.com/office/drawing/2017/model3d" xmlns:o="urn:schemas-microsoft-com:office:office" xmlns:oel="http://schemas.microsoft.com/office/2019/extlst" xmlns:r="http://schemas.openxmlformats.org/officeDocument/2006/relationships" xmlns:m="http://schemas.openxmlformats.org/officeDocument/2006/math" xmlns:v="urn:schemas-microsoft-com:vml" xmlns:wp14="http://schemas.microsoft.com/office/word/2010/wordprocessingDrawing" xmlns:wp="http://schemas.openxmlformats.org/drawingml/2006/wordprocessingDrawing" xmlns:w10="urn:schemas-microsoft-com:office:word" xmlns:w="http://schemas.openxmlformats.org/wordprocessingml/2006/main" xmlns:w14="http://schemas.microsoft.com/office/word/2010/wordml" xmlns:w15="http://schemas.microsoft.com/office/word/2012/wordml" xmlns:w16cex="http://schemas.microsoft.com/office/word/2018/wordml/cex" xmlns:w16cid="http://schemas.microsoft.com/office/word/2016/wordml/cid" xmlns:w16="http://schemas.microsoft.com/office/word/2018/wordml" xmlns:w16du="http://schemas.microsoft.com/office/word/2023/wordml/word16du" xmlns:w16sdtdh="http://schemas.microsoft.com/office/word/2020/wordml/sdtdatahash" xmlns:w16sdtfl="http://schemas.microsoft.com/office/word/2024/wordml/sdtformatlock" xmlns:w16se="http://schemas.microsoft.com/office/word/2015/wordml/symex" xmlns:wpg="http://schemas.microsoft.com/office/word/2010/wordprocessingGroup" xmlns:wpi="http://schemas.microsoft.com/office/word/2010/wordprocessingInk" xmlns:wne="http://schemas.microsoft.com/office/word/2006/wordml" xmlns:wps="http://schemas.microsoft.com/office/word/2010/wordprocessingShape" mc:Ignorable="w14 w15 w16se w16cid w16 w16cex w16sdtdh w16sdtfl w16du wp14">
   <w:p>
     <w:pPr>
-      <w:jc w:val="right"/>
+      <w:pBdr>
+        <w:bottom w:val="single" w:sz="12" w:space="6" w:color="76BAB2"/>
+      </w:pBdr>
+      <w:tabs>
+        <w:tab w:val="right" w:pos="9638"/>
+      </w:tabs>
     </w:pPr>
+    <w:r>
+      <w:rPr>
+        <w:noProof/>
+      </w:rPr>
+      <w:drawing>
+        <wp:inline distT="0" distB="0" distL="0" distR="0">
+          <wp:extent cx="805759" cy="300000"/>
+          <wp:effectExtent l="0" t="0" r="0" b="0"/>
+          <wp:docPr id="901" name="Otta logo" descr="Otta"/>
+          <wp:cNvGraphicFramePr>
+            <a:graphicFrameLocks xmlns:a="http://schemas.openxmlformats.org/drawingml/2006/main" noChangeAspect="1"/>
+          </wp:cNvGraphicFramePr>
+          <a:graphic xmlns:a="http://schemas.openxmlformats.org/drawingml/2006/main">
+            <a:graphicData uri="http://schemas.openxmlformats.org/drawingml/2006/picture">
+              <pic:pic xmlns:pic="http://schemas.openxmlformats.org/drawingml/2006/picture">
+                <pic:nvPicPr>
+                  <pic:cNvPr id="901" name="otta-logo.png"/>
+                  <pic:cNvPicPr/>
+                </pic:nvPicPr>
+                <pic:blipFill>
+                  <a:blip r:embed="rIdOttaLogo"/>
+                  <a:stretch>
+                    <a:fillRect/>
+                  </a:stretch>
+                </pic:blipFill>
+                <pic:spPr>
+                  <a:xfrm>
+                    <a:off x="0" y="0"/>
+                    <a:ext cx="805759" cy="300000"/>
+                  </a:xfrm>
+                  <a:prstGeom prst="rect">
+                    <a:avLst/>
+                  </a:prstGeom>
+                </pic:spPr>
+              </pic:pic>
+            </a:graphicData>
+          </a:graphic>
+        </wp:inline>
+      </w:drawing>
+    </w:r>
+    <w:r>
+      <w:tab/>
+    </w:r>
     <w:r>
       <w:rPr>
         <w:color w:val="7A7F80"/>
@@ -18837,7 +18891,7 @@
   <w:docDefaults>
     <w:rPrDefault>
       <w:rPr>
-        <w:rFonts w:ascii="Arial" w:eastAsia="Arial" w:hAnsi="Arial" w:cs="Arial"/>
+        <w:rFonts w:ascii="Raleway" w:eastAsia="Raleway" w:hAnsi="Raleway" w:cs="Arial"/>
         <w:color w:val="303133"/>
         <w:sz w:val="21"/>
         <w:szCs w:val="21"/>
@@ -19350,7 +19404,7 @@
     <w:uiPriority w:val="99"/>
     <w:unhideWhenUsed/>
     <w:rPr>
-      <w:color w:val="0563C1"/>
+      <w:color w:val="2E7D74"/>
       <w:u w:val="single"/>
     </w:rPr>
   </w:style>

</xml_diff>